<commit_message>
Update FALCON compact buoy revision docs
</commit_message>
<xml_diff>
--- a/THESIS DOCUMENTATION/FALCON Revised Event Driven BOM and Sensor Options.docx
+++ b/THESIS DOCUMENTATION/FALCON Revised Event Driven BOM and Sensor Options.docx
@@ -22,7 +22,7 @@
     </w:p>
     <w:p>
       <w:r>
-        <w:t>This document defines a lower-cost single-tube buoy using an ESP32, event-driven telemetry, and cloud connectivity. It lists the required equipment, optional sensors, alternative water-pressure approaches, indicative Philippine prices, and purchase sources. Prices are planning estimates only and must be replaced by supplier quotations before procurement.</w:t>
+        <w:t>This document defines a lower-cost compact can-buoy using an ESP32, event-driven telemetry, and cloud connectivity. It lists the required equipment, optional sensors, alternative water-pressure approaches, indicative Philippine prices, and purchase sources. Prices are planning estimates only and must be replaced by supplier quotations before procurement.</w:t>
       </w:r>
     </w:p>
     <w:p>
@@ -3869,7 +3869,7 @@
     </w:p>
     <w:p>
       <w:r>
-        <w:t>These totals exclude the tube, buoyancy material, enclosure, solar panel, battery, charge controller, mooring, fabrication, transport, cloud data plan, and field safety costs. The pressure sensor and waterproof mechanical construction remain the largest uncertainties.</w:t>
+        <w:t>These totals exclude the round float body, tapered housing, enclosure, solar panel, battery, charge controller, mooring, fabrication, transport, cloud data plan, and field safety costs. The pressure sensor and waterproof mechanical construction remain the largest uncertainties.</w:t>
       </w:r>
     </w:p>
     <w:p>

</xml_diff>